<commit_message>
Use Pivdenkabel datasheet for AASHv 3x120-10 in VEK instruction and factory request
Co-Authored-By: Claude Opus 5.5 <noreply@anthropic.com>
Claude-Session: https://claude.ai/code/session_01TjoMZcWDWdWMUNF5j2gzER
</commit_message>
<xml_diff>
--- a/tenders/UA-2026-10-12-007152-a/Інструкція_ВЕК_кваліфікація_і_подача_UA-2026-10-12-007152-a.docx
+++ b/tenders/UA-2026-10-12-007152-a/Інструкція_ВЕК_кваліфікація_і_подача_UA-2026-10-12-007152-a.docx
@@ -1329,7 +1329,7 @@
               <w:rPr>
                 <w:sz w:val="18"/>
               </w:rPr>
-              <w:t>Марка в сертифікаті та маркуванні</w:t>
+              <w:t>ААШв 3x120-10, ТУ У 27.3-00214534-091:2017</w:t>
             </w:r>
           </w:p>
         </w:tc>
@@ -1597,7 +1597,7 @@
               <w:rPr>
                 <w:sz w:val="18"/>
               </w:rPr>
-              <w:t>! Специфікація вимагає «монолітна жила» — див. ризики</w:t>
+              <w:t>Жила алюмінієва багатопроволочна ущільнена (формуляр заводу). ! Специфікація: «монолітна» — див. ризики</w:t>
             </w:r>
           </w:p>
         </w:tc>
@@ -1664,7 +1664,7 @@
               <w:rPr>
                 <w:sz w:val="18"/>
               </w:rPr>
-              <w:t>! Для 3х120 зазвичай роблять секторні жили — запитано в замовника</w:t>
+              <w:t>Секторна / сегментна — немає у формулярі, запитано в заводу і в замовника</w:t>
             </w:r>
           </w:p>
         </w:tc>
@@ -1932,7 +1932,7 @@
               <w:rPr>
                 <w:sz w:val="18"/>
               </w:rPr>
-              <w:t>Лист або паспорт заводу: строк служби не менше 30 років</w:t>
+              <w:t>Немає у формулярі — запитано в заводу письмово (≥ 30 років)</w:t>
             </w:r>
           </w:p>
         </w:tc>
@@ -1999,7 +1999,7 @@
               <w:rPr>
                 <w:sz w:val="18"/>
               </w:rPr>
-              <w:t>Сертифікат / декларація відповідності</w:t>
+              <w:t>Сертифікат / декларація відповідності; клас жили підтверджує завод</w:t>
             </w:r>
           </w:p>
         </w:tc>
@@ -2024,6 +2024,362 @@
         <w:t>Вимоги Специфікації (Додаток 1 до договору), які треба виконати під час поставки: 150 м одним відрізком; рік виготовлення не раніше 2023; поставка на барабані № 16 з поверненням тари; кінці кабелю закриті термоусадковими капами; поставка протягом 15 календарних днів з дати договору (не пізніше 15.12.2026) за адресою м. Славутич, вул. Військових будівельників, 8; про поставку повідомити за 3 робочі дні (проїзд у зону відчуження). Разом з товаром передаються: 3 примірники видаткової накладної, сертифікат або декларація про походження товару, сертифікат або декларація відповідності.</w:t>
       </w:r>
     </w:p>
+    <w:p>
+      <w:r>
+        <w:rPr>
+          <w:b/>
+        </w:rPr>
+        <w:t>5.1. Дані формуляра заводу ААШв 3x120-10 (для довідки та листів)</w:t>
+      </w:r>
+    </w:p>
+    <w:tbl>
+      <w:tblPr>
+        <w:tblStyle w:val="TableGrid"/>
+        <w:tblW w:type="auto" w:w="0"/>
+        <w:tblLook w:firstColumn="1" w:firstRow="1" w:lastColumn="0" w:lastRow="0" w:noHBand="0" w:noVBand="1" w:val="04A0"/>
+      </w:tblPr>
+      <w:tblGrid>
+        <w:gridCol w:w="4819"/>
+        <w:gridCol w:w="4819"/>
+      </w:tblGrid>
+      <w:tr>
+        <w:tc>
+          <w:tcPr>
+            <w:tcW w:type="dxa" w:w="4819"/>
+          </w:tcPr>
+          <w:p>
+            <w:r>
+              <w:rPr>
+                <w:sz w:val="20"/>
+              </w:rPr>
+              <w:t>Нормативний документ</w:t>
+            </w:r>
+          </w:p>
+        </w:tc>
+        <w:tc>
+          <w:tcPr>
+            <w:tcW w:type="dxa" w:w="4819"/>
+          </w:tcPr>
+          <w:p>
+            <w:r>
+              <w:rPr>
+                <w:sz w:val="20"/>
+              </w:rPr>
+              <w:t>ТУ У 27.3-00214534-091:2017</w:t>
+            </w:r>
+          </w:p>
+        </w:tc>
+      </w:tr>
+      <w:tr>
+        <w:tc>
+          <w:tcPr>
+            <w:tcW w:type="dxa" w:w="4819"/>
+          </w:tcPr>
+          <w:p>
+            <w:r>
+              <w:rPr>
+                <w:sz w:val="20"/>
+              </w:rPr>
+              <w:t>Конструкція</w:t>
+            </w:r>
+          </w:p>
+        </w:tc>
+        <w:tc>
+          <w:tcPr>
+            <w:tcW w:type="dxa" w:w="4819"/>
+          </w:tcPr>
+          <w:p>
+            <w:r>
+              <w:rPr>
+                <w:sz w:val="20"/>
+              </w:rPr>
+              <w:t>Al багатопроволочна ущільнена жила; паперова просочена ізоляція; поясна ізоляція; екран з електропровідного паперу; алюмінієва оболонка; захисний шланг з ПВХ пластикату</w:t>
+            </w:r>
+          </w:p>
+        </w:tc>
+      </w:tr>
+      <w:tr>
+        <w:tc>
+          <w:tcPr>
+            <w:tcW w:type="dxa" w:w="4819"/>
+          </w:tcPr>
+          <w:p>
+            <w:r>
+              <w:rPr>
+                <w:sz w:val="20"/>
+              </w:rPr>
+              <w:t>Напруга / переріз</w:t>
+            </w:r>
+          </w:p>
+        </w:tc>
+        <w:tc>
+          <w:tcPr>
+            <w:tcW w:type="dxa" w:w="4819"/>
+          </w:tcPr>
+          <w:p>
+            <w:r>
+              <w:rPr>
+                <w:sz w:val="20"/>
+              </w:rPr>
+              <w:t>10 кВ / 3 × 120 мм²</w:t>
+            </w:r>
+          </w:p>
+        </w:tc>
+      </w:tr>
+      <w:tr>
+        <w:tc>
+          <w:tcPr>
+            <w:tcW w:type="dxa" w:w="4819"/>
+          </w:tcPr>
+          <w:p>
+            <w:r>
+              <w:rPr>
+                <w:sz w:val="20"/>
+              </w:rPr>
+              <w:t>Ізоляція між жилами / жила–оболонка</w:t>
+            </w:r>
+          </w:p>
+        </w:tc>
+        <w:tc>
+          <w:tcPr>
+            <w:tcW w:type="dxa" w:w="4819"/>
+          </w:tcPr>
+          <w:p>
+            <w:r>
+              <w:rPr>
+                <w:sz w:val="20"/>
+              </w:rPr>
+              <w:t>5,5 мм / 4,0 мм</w:t>
+            </w:r>
+          </w:p>
+        </w:tc>
+      </w:tr>
+      <w:tr>
+        <w:tc>
+          <w:tcPr>
+            <w:tcW w:type="dxa" w:w="4819"/>
+          </w:tcPr>
+          <w:p>
+            <w:r>
+              <w:rPr>
+                <w:sz w:val="20"/>
+              </w:rPr>
+              <w:t>Струм (повітря / ґрунт)</w:t>
+            </w:r>
+          </w:p>
+        </w:tc>
+        <w:tc>
+          <w:tcPr>
+            <w:tcW w:type="dxa" w:w="4819"/>
+          </w:tcPr>
+          <w:p>
+            <w:r>
+              <w:rPr>
+                <w:sz w:val="20"/>
+              </w:rPr>
+              <w:t>234 А / 218 А</w:t>
+            </w:r>
+          </w:p>
+        </w:tc>
+      </w:tr>
+      <w:tr>
+        <w:tc>
+          <w:tcPr>
+            <w:tcW w:type="dxa" w:w="4819"/>
+          </w:tcPr>
+          <w:p>
+            <w:r>
+              <w:rPr>
+                <w:sz w:val="20"/>
+              </w:rPr>
+              <w:t>Діапазон робочих температур</w:t>
+            </w:r>
+          </w:p>
+        </w:tc>
+        <w:tc>
+          <w:tcPr>
+            <w:tcW w:type="dxa" w:w="4819"/>
+          </w:tcPr>
+          <w:p>
+            <w:r>
+              <w:rPr>
+                <w:sz w:val="20"/>
+              </w:rPr>
+              <w:t>-50 … +50 °C</w:t>
+            </w:r>
+          </w:p>
+        </w:tc>
+      </w:tr>
+      <w:tr>
+        <w:tc>
+          <w:tcPr>
+            <w:tcW w:type="dxa" w:w="4819"/>
+          </w:tcPr>
+          <w:p>
+            <w:r>
+              <w:rPr>
+                <w:sz w:val="20"/>
+              </w:rPr>
+              <w:t>Мінімальний радіус вигину</w:t>
+            </w:r>
+          </w:p>
+        </w:tc>
+        <w:tc>
+          <w:tcPr>
+            <w:tcW w:type="dxa" w:w="4819"/>
+          </w:tcPr>
+          <w:p>
+            <w:r>
+              <w:rPr>
+                <w:sz w:val="20"/>
+              </w:rPr>
+              <w:t>1175 мм</w:t>
+            </w:r>
+          </w:p>
+        </w:tc>
+      </w:tr>
+      <w:tr>
+        <w:tc>
+          <w:tcPr>
+            <w:tcW w:type="dxa" w:w="4819"/>
+          </w:tcPr>
+          <w:p>
+            <w:r>
+              <w:rPr>
+                <w:sz w:val="20"/>
+              </w:rPr>
+              <w:t>Зовнішній діаметр (довідково)</w:t>
+            </w:r>
+          </w:p>
+        </w:tc>
+        <w:tc>
+          <w:tcPr>
+            <w:tcW w:type="dxa" w:w="4819"/>
+          </w:tcPr>
+          <w:p>
+            <w:r>
+              <w:rPr>
+                <w:sz w:val="20"/>
+              </w:rPr>
+              <w:t>47 мм</w:t>
+            </w:r>
+          </w:p>
+        </w:tc>
+      </w:tr>
+      <w:tr>
+        <w:tc>
+          <w:tcPr>
+            <w:tcW w:type="dxa" w:w="4819"/>
+          </w:tcPr>
+          <w:p>
+            <w:r>
+              <w:rPr>
+                <w:sz w:val="20"/>
+              </w:rPr>
+              <w:t>Маса</w:t>
+            </w:r>
+          </w:p>
+        </w:tc>
+        <w:tc>
+          <w:tcPr>
+            <w:tcW w:type="dxa" w:w="4819"/>
+          </w:tcPr>
+          <w:p>
+            <w:r>
+              <w:rPr>
+                <w:sz w:val="20"/>
+              </w:rPr>
+              <w:t>≈ 2970 кг/км, тобто ≈ 446 кг на 150 м</w:t>
+            </w:r>
+          </w:p>
+        </w:tc>
+      </w:tr>
+      <w:tr>
+        <w:tc>
+          <w:tcPr>
+            <w:tcW w:type="dxa" w:w="4819"/>
+          </w:tcPr>
+          <w:p>
+            <w:r>
+              <w:rPr>
+                <w:sz w:val="20"/>
+              </w:rPr>
+              <w:t>Код пожежної безпеки (ДСТУ 4809:2007)</w:t>
+            </w:r>
+          </w:p>
+        </w:tc>
+        <w:tc>
+          <w:tcPr>
+            <w:tcW w:type="dxa" w:w="4819"/>
+          </w:tcPr>
+          <w:p>
+            <w:r>
+              <w:rPr>
+                <w:sz w:val="20"/>
+              </w:rPr>
+              <w:t>ПБ100000000</w:t>
+            </w:r>
+          </w:p>
+        </w:tc>
+      </w:tr>
+      <w:tr>
+        <w:tc>
+          <w:tcPr>
+            <w:tcW w:type="dxa" w:w="4819"/>
+          </w:tcPr>
+          <w:p>
+            <w:r>
+              <w:rPr>
+                <w:sz w:val="20"/>
+              </w:rPr>
+              <w:t>Барабан у формулярі</w:t>
+            </w:r>
+          </w:p>
+        </w:tc>
+        <w:tc>
+          <w:tcPr>
+            <w:tcW w:type="dxa" w:w="4819"/>
+          </w:tcPr>
+          <w:p>
+            <w:r>
+              <w:rPr>
+                <w:sz w:val="20"/>
+              </w:rPr>
+              <w:t>№ 18 (500 м). Замовник вимагає № 16 для 150 м — погодити із заводом</w:t>
+            </w:r>
+          </w:p>
+        </w:tc>
+      </w:tr>
+      <w:tr>
+        <w:tc>
+          <w:tcPr>
+            <w:tcW w:type="dxa" w:w="4819"/>
+          </w:tcPr>
+          <w:p>
+            <w:r>
+              <w:rPr>
+                <w:sz w:val="20"/>
+              </w:rPr>
+              <w:t>Контакти заводу</w:t>
+            </w:r>
+          </w:p>
+        </w:tc>
+        <w:tc>
+          <w:tcPr>
+            <w:tcW w:type="dxa" w:w="4819"/>
+          </w:tcPr>
+          <w:p>
+            <w:r>
+              <w:rPr>
+                <w:sz w:val="20"/>
+              </w:rPr>
+              <w:t>м. Харків, вул. Автогенна, 7, 61099; (057) 728-12-44, 728-12-41; market@yuzhcable.com.ua</w:t>
+            </w:r>
+          </w:p>
+        </w:tc>
+      </w:tr>
+    </w:tbl>
+    <w:p/>
     <w:p>
       <w:pPr>
         <w:spacing w:after="80"/>

</xml_diff>

<commit_message>
Fix risk notes on Pivdenkabel production and conductor type
Co-Authored-By: Claude Opus 5.5 <noreply@anthropic.com>
Claude-Session: https://claude.ai/code/session_01TjoMZcWDWdWMUNF5j2gzER
</commit_message>
<xml_diff>
--- a/tenders/UA-2026-10-12-007152-a/Інструкція_ВЕК_кваліфікація_і_подача_UA-2026-10-12-007152-a.docx
+++ b/tenders/UA-2026-10-12-007152-a/Інструкція_ВЕК_кваліфікація_і_подача_UA-2026-10-12-007152-a.docx
@@ -2404,7 +2404,7 @@
           <w:b w:val="0"/>
           <w:i w:val="0"/>
         </w:rPr>
-        <w:t>• ЖИЛА. Критерій вимагає «багатожильний», а Специфікація — «монолітна». Від заводу потрібне точне виконання (ож / ом) і письмова відповідь замовника. Якщо замовник не відповість, подаємо з відповідями «як у критерії», але ризик спору під час приймання (п. 5.6, 7.2.9–7.2.12 договору) залишається.</w:t>
+        <w:t>• ЖИЛА. У критерії вказано «багатожильний», у Специфікації — «монолітна жила». На заводі є обидва варіанти: ААШв 3x120-10 (багатопроволочна) та ААШв 3x120(ож)-10 (монолітна). Оцінка йде за критеріями системи, тому подаємо ААШв 3x120-10. До поставки потрібне письмове погодження замовника (лист надіслано). Якщо замовник наполягатиме на «монолітній», завод може поставити (ож) — виконання погодити листом замовника.</w:t>
       </w:r>
     </w:p>
     <w:p>
@@ -2418,7 +2418,7 @@
           <w:b w:val="0"/>
           <w:i w:val="0"/>
         </w:rPr>
-        <w:t>• ВИРОБНИЦТВО. На сайті «Південкабелю» серед продукції не видно кабелів з паперовою ізоляцією. Обов’язково отримайте ПИСЬМОВЕ підтвердження, що завод виготовить або має на складі ААШв-10 3х120 2023–2026 р.в., і строк відвантаження.</w:t>
+        <w:t>• ВИРОБНИЦТВО ПІДТВЕРДЖЕНО. ПАТ «Завод «Південкабель» (ЄДРПОУ 00214534, м. Харків) випускає ААШв 3x120-10 за ТУ У 27.3-00214534-091:2017 (довідник продукції yuzhcable.info). Пропонуємо варіант ААШв 3x120-10 — БЕЗ позначки (ож): жила алюмінієва багатопроволочна ущільнена, що відповідає критерію «багатожильний». Варіант (ож) — однопроволочна (монолітна) жила, яку вимагає Специфікація. Від заводу письмово отримати: наявність або строк виготовлення, рік виготовлення, відрізок 150 м і барабан.</w:t>
       </w:r>
     </w:p>
     <w:p>

</xml_diff>